<commit_message>
minor changes, mostly to comments
</commit_message>
<xml_diff>
--- a/BigIntCalculator/Modular square root (V2).docx
+++ b/BigIntCalculator/Modular square root (V2).docx
@@ -1366,6 +1366,7 @@
           <w:highlight w:val="white"/>
         </w:rPr>
       </w:pPr>
+      <w:proofErr w:type="gramStart"/>
       <w:r>
         <w:rPr>
           <w:rFonts w:cstheme="minorHAnsi"/>
@@ -1391,7 +1392,17 @@
           <w:szCs w:val="24"/>
           <w:highlight w:val="white"/>
         </w:rPr>
-        <w:t xml:space="preserve">i &gt;1, </w:t>
+        <w:t>i</w:t>
+      </w:r>
+      <w:proofErr w:type="gramEnd"/>
+      <w:r>
+        <w:rPr>
+          <w:rFonts w:cstheme="minorHAnsi"/>
+          <w:sz w:val="24"/>
+          <w:szCs w:val="24"/>
+          <w:highlight w:val="white"/>
+        </w:rPr>
+        <w:t xml:space="preserve"> &gt;1, </w:t>
       </w:r>
       <w:r>
         <w:rPr>
@@ -1463,6 +1474,7 @@
           <w:highlight w:val="white"/>
         </w:rPr>
       </w:pPr>
+      <w:proofErr w:type="gramStart"/>
       <w:r>
         <w:rPr>
           <w:rFonts w:cstheme="minorHAnsi"/>
@@ -1488,7 +1500,17 @@
           <w:szCs w:val="24"/>
           <w:highlight w:val="white"/>
         </w:rPr>
-        <w:t xml:space="preserve">i &gt;1, </w:t>
+        <w:t>i</w:t>
+      </w:r>
+      <w:proofErr w:type="gramEnd"/>
+      <w:r>
+        <w:rPr>
+          <w:rFonts w:cstheme="minorHAnsi"/>
+          <w:sz w:val="24"/>
+          <w:szCs w:val="24"/>
+          <w:highlight w:val="white"/>
+        </w:rPr>
+        <w:t xml:space="preserve"> &gt;1, </w:t>
       </w:r>
       <w:r>
         <w:rPr>
@@ -1560,6 +1582,7 @@
           <w:highlight w:val="white"/>
         </w:rPr>
       </w:pPr>
+      <w:proofErr w:type="gramStart"/>
       <w:r>
         <w:rPr>
           <w:rFonts w:cstheme="minorHAnsi"/>
@@ -1585,7 +1608,17 @@
           <w:szCs w:val="24"/>
           <w:highlight w:val="white"/>
         </w:rPr>
-        <w:t xml:space="preserve">i &gt;1, </w:t>
+        <w:t>i</w:t>
+      </w:r>
+      <w:proofErr w:type="gramEnd"/>
+      <w:r>
+        <w:rPr>
+          <w:rFonts w:cstheme="minorHAnsi"/>
+          <w:sz w:val="24"/>
+          <w:szCs w:val="24"/>
+          <w:highlight w:val="white"/>
+        </w:rPr>
+        <w:t xml:space="preserve"> &gt;1, </w:t>
       </w:r>
       <w:r>
         <w:rPr>
@@ -1678,6 +1711,7 @@
         </w:rPr>
         <w:t xml:space="preserve">i &gt;1, </w:t>
       </w:r>
+      <w:proofErr w:type="gramStart"/>
       <w:r>
         <w:rPr>
           <w:rFonts w:cstheme="minorHAnsi"/>
@@ -1685,7 +1719,17 @@
           <w:szCs w:val="24"/>
           <w:highlight w:val="white"/>
         </w:rPr>
-        <w:t xml:space="preserve">gcd(x, </w:t>
+        <w:t>gcd(</w:t>
+      </w:r>
+      <w:proofErr w:type="gramEnd"/>
+      <w:r>
+        <w:rPr>
+          <w:rFonts w:cstheme="minorHAnsi"/>
+          <w:sz w:val="24"/>
+          <w:szCs w:val="24"/>
+          <w:highlight w:val="white"/>
+        </w:rPr>
+        <w:t xml:space="preserve">x, </w:t>
       </w:r>
       <w:r>
         <w:rPr>
@@ -1775,6 +1819,7 @@
         </w:rPr>
         <w:t xml:space="preserve">i &gt;1, </w:t>
       </w:r>
+      <w:proofErr w:type="gramStart"/>
       <w:r>
         <w:rPr>
           <w:rFonts w:cstheme="minorHAnsi"/>
@@ -1782,7 +1827,17 @@
           <w:szCs w:val="24"/>
           <w:highlight w:val="white"/>
         </w:rPr>
-        <w:t>gcd(x</w:t>
+        <w:t>gcd(</w:t>
+      </w:r>
+      <w:proofErr w:type="gramEnd"/>
+      <w:r>
+        <w:rPr>
+          <w:rFonts w:cstheme="minorHAnsi"/>
+          <w:sz w:val="24"/>
+          <w:szCs w:val="24"/>
+          <w:highlight w:val="white"/>
+        </w:rPr>
+        <w:t>x</w:t>
       </w:r>
       <w:r>
         <w:rPr>
@@ -1858,13 +1913,23 @@
           <w:szCs w:val="24"/>
         </w:rPr>
       </w:pPr>
-      <w:r>
-        <w:rPr>
-          <w:rFonts w:cstheme="minorHAnsi"/>
-          <w:sz w:val="24"/>
-          <w:szCs w:val="24"/>
-        </w:rPr>
-        <w:t xml:space="preserve">i.e. </w:t>
+      <w:proofErr w:type="gramStart"/>
+      <w:r>
+        <w:rPr>
+          <w:rFonts w:cstheme="minorHAnsi"/>
+          <w:sz w:val="24"/>
+          <w:szCs w:val="24"/>
+        </w:rPr>
+        <w:t>i.e.</w:t>
+      </w:r>
+      <w:proofErr w:type="gramEnd"/>
+      <w:r>
+        <w:rPr>
+          <w:rFonts w:cstheme="minorHAnsi"/>
+          <w:sz w:val="24"/>
+          <w:szCs w:val="24"/>
+        </w:rPr>
+        <w:t xml:space="preserve"> </w:t>
       </w:r>
       <w:r>
         <w:rPr>
@@ -2307,6 +2372,273 @@
     </w:p>
     <w:p>
       <w:pPr>
+        <w:rPr>
+          <w:rFonts w:cstheme="minorHAnsi"/>
+          <w:sz w:val="24"/>
+          <w:szCs w:val="24"/>
+        </w:rPr>
+      </w:pPr>
+      <w:r>
+        <w:rPr>
+          <w:rFonts w:cstheme="minorHAnsi"/>
+          <w:sz w:val="24"/>
+          <w:szCs w:val="24"/>
+        </w:rPr>
+        <w:t xml:space="preserve">If </w:t>
+      </w:r>
+      <w:r>
+        <w:rPr>
+          <w:rFonts w:cstheme="minorHAnsi"/>
+          <w:b/>
+          <w:bCs/>
+          <w:i/>
+          <w:iCs/>
+          <w:sz w:val="24"/>
+          <w:szCs w:val="24"/>
+        </w:rPr>
+        <w:t>p=2</w:t>
+      </w:r>
+      <w:r>
+        <w:rPr>
+          <w:rFonts w:cstheme="minorHAnsi"/>
+          <w:sz w:val="24"/>
+          <w:szCs w:val="24"/>
+        </w:rPr>
+        <w:t xml:space="preserve">, </w:t>
+      </w:r>
+      <w:r>
+        <w:rPr>
+          <w:rFonts w:cstheme="minorHAnsi"/>
+          <w:b/>
+          <w:bCs/>
+          <w:i/>
+          <w:iCs/>
+          <w:sz w:val="24"/>
+          <w:szCs w:val="24"/>
+        </w:rPr>
+        <w:t>x=0</w:t>
+      </w:r>
+      <w:r>
+        <w:rPr>
+          <w:rFonts w:cstheme="minorHAnsi"/>
+          <w:sz w:val="24"/>
+          <w:szCs w:val="24"/>
+        </w:rPr>
+        <w:t xml:space="preserve"> or </w:t>
+      </w:r>
+      <w:r>
+        <w:rPr>
+          <w:rFonts w:cstheme="minorHAnsi"/>
+          <w:b/>
+          <w:bCs/>
+          <w:i/>
+          <w:iCs/>
+          <w:sz w:val="24"/>
+          <w:szCs w:val="24"/>
+        </w:rPr>
+        <w:t>1</w:t>
+      </w:r>
+      <w:r>
+        <w:rPr>
+          <w:rFonts w:cstheme="minorHAnsi"/>
+          <w:sz w:val="24"/>
+          <w:szCs w:val="24"/>
+        </w:rPr>
+        <w:t xml:space="preserve"> once ‘normalised’</w:t>
+      </w:r>
+      <w:r>
+        <w:rPr>
+          <w:rFonts w:cstheme="minorHAnsi"/>
+          <w:sz w:val="24"/>
+          <w:szCs w:val="24"/>
+        </w:rPr>
+        <w:t xml:space="preserve">, and </w:t>
+      </w:r>
+      <w:r>
+        <w:rPr>
+          <w:rFonts w:cstheme="minorHAnsi"/>
+          <w:b/>
+          <w:bCs/>
+          <w:i/>
+          <w:iCs/>
+          <w:sz w:val="24"/>
+          <w:szCs w:val="24"/>
+        </w:rPr>
+        <w:t>r=x</w:t>
+      </w:r>
+      <w:r>
+        <w:rPr>
+          <w:rFonts w:cstheme="minorHAnsi"/>
+          <w:sz w:val="24"/>
+          <w:szCs w:val="24"/>
+        </w:rPr>
+        <w:t>.</w:t>
+      </w:r>
+    </w:p>
+    <w:p>
+      <w:pPr>
+        <w:rPr>
+          <w:sz w:val="24"/>
+          <w:szCs w:val="24"/>
+        </w:rPr>
+      </w:pPr>
+      <w:r>
+        <w:rPr>
+          <w:rFonts w:cstheme="minorHAnsi"/>
+          <w:sz w:val="24"/>
+          <w:szCs w:val="24"/>
+        </w:rPr>
+        <w:t>For odd p, i</w:t>
+      </w:r>
+      <w:r>
+        <w:rPr>
+          <w:rFonts w:cstheme="minorHAnsi"/>
+          <w:sz w:val="24"/>
+          <w:szCs w:val="24"/>
+        </w:rPr>
+        <w:t xml:space="preserve">f the </w:t>
+      </w:r>
+      <w:r>
+        <w:rPr>
+          <w:rFonts w:cstheme="minorHAnsi"/>
+          <w:sz w:val="24"/>
+          <w:szCs w:val="24"/>
+        </w:rPr>
+        <w:t>Legendre</w:t>
+      </w:r>
+      <w:r>
+        <w:rPr>
+          <w:rFonts w:cstheme="minorHAnsi"/>
+          <w:sz w:val="24"/>
+          <w:szCs w:val="24"/>
+        </w:rPr>
+        <w:t xml:space="preserve"> symbol (x/p) is not 1 there are no solutions.</w:t>
+      </w:r>
+      <w:r>
+        <w:rPr>
+          <w:rFonts w:cstheme="minorHAnsi"/>
+          <w:sz w:val="24"/>
+          <w:szCs w:val="24"/>
+        </w:rPr>
+        <w:t xml:space="preserve"> </w:t>
+      </w:r>
+      <w:proofErr w:type="gramStart"/>
+      <w:r>
+        <w:rPr>
+          <w:sz w:val="24"/>
+          <w:szCs w:val="24"/>
+        </w:rPr>
+        <w:t>The  Legendre</w:t>
+      </w:r>
+      <w:proofErr w:type="gramEnd"/>
+      <w:r>
+        <w:rPr>
+          <w:sz w:val="24"/>
+          <w:szCs w:val="24"/>
+        </w:rPr>
+        <w:t xml:space="preserve"> symbol</w:t>
+      </w:r>
+      <w:r>
+        <w:rPr>
+          <w:b/>
+          <w:bCs/>
+          <w:i/>
+          <w:iCs/>
+          <w:sz w:val="24"/>
+          <w:szCs w:val="24"/>
+        </w:rPr>
+        <w:t>(x/p)</w:t>
+      </w:r>
+      <w:r>
+        <w:rPr>
+          <w:b/>
+          <w:bCs/>
+          <w:i/>
+          <w:iCs/>
+          <w:sz w:val="24"/>
+          <w:szCs w:val="24"/>
+        </w:rPr>
+        <w:t xml:space="preserve"> </w:t>
+      </w:r>
+      <w:r>
+        <w:rPr>
+          <w:sz w:val="24"/>
+          <w:szCs w:val="24"/>
+        </w:rPr>
+        <w:t>can be</w:t>
+      </w:r>
+      <w:r>
+        <w:t xml:space="preserve"> </w:t>
+      </w:r>
+      <w:r>
+        <w:rPr>
+          <w:sz w:val="24"/>
+          <w:szCs w:val="24"/>
+        </w:rPr>
+        <w:t xml:space="preserve">calculated as </w:t>
+      </w:r>
+      <w:r>
+        <w:rPr>
+          <w:b/>
+          <w:bCs/>
+          <w:i/>
+          <w:iCs/>
+          <w:sz w:val="24"/>
+          <w:szCs w:val="24"/>
+        </w:rPr>
+        <w:t>x</w:t>
+      </w:r>
+      <w:r>
+        <w:rPr>
+          <w:b/>
+          <w:bCs/>
+          <w:i/>
+          <w:iCs/>
+          <w:sz w:val="24"/>
+          <w:szCs w:val="24"/>
+          <w:vertAlign w:val="superscript"/>
+        </w:rPr>
+        <w:t>(p-1)/2</w:t>
+      </w:r>
+      <w:r>
+        <w:rPr>
+          <w:b/>
+          <w:bCs/>
+          <w:i/>
+          <w:iCs/>
+          <w:sz w:val="24"/>
+          <w:szCs w:val="24"/>
+        </w:rPr>
+        <w:t xml:space="preserve">  </w:t>
+      </w:r>
+      <w:r>
+        <w:rPr>
+          <w:sz w:val="24"/>
+          <w:szCs w:val="24"/>
+        </w:rPr>
+        <w:t xml:space="preserve">(mod </w:t>
+      </w:r>
+      <w:r>
+        <w:rPr>
+          <w:b/>
+          <w:bCs/>
+          <w:i/>
+          <w:iCs/>
+          <w:sz w:val="24"/>
+          <w:szCs w:val="24"/>
+        </w:rPr>
+        <w:t>p</w:t>
+      </w:r>
+      <w:r>
+        <w:rPr>
+          <w:sz w:val="24"/>
+          <w:szCs w:val="24"/>
+        </w:rPr>
+        <w:t>)</w:t>
+      </w:r>
+    </w:p>
+    <w:p>
+      <w:pPr>
         <w:spacing w:before="240"/>
         <w:rPr>
           <w:rFonts w:cstheme="minorHAnsi"/>
@@ -2314,6 +2646,15 @@
           <w:szCs w:val="24"/>
         </w:rPr>
       </w:pPr>
+    </w:p>
+    <w:p>
+      <w:pPr>
+        <w:rPr>
+          <w:rFonts w:cstheme="minorHAnsi"/>
+          <w:sz w:val="24"/>
+          <w:szCs w:val="24"/>
+        </w:rPr>
+      </w:pPr>
       <w:r>
         <w:rPr>
           <w:rFonts w:cstheme="minorHAnsi"/>
@@ -2332,31 +2673,43 @@
           <w:sz w:val="24"/>
           <w:szCs w:val="24"/>
         </w:rPr>
-        <w:t>p=2</w:t>
-      </w:r>
-      <w:r>
-        <w:rPr>
-          <w:rFonts w:cstheme="minorHAnsi"/>
-          <w:sz w:val="24"/>
-          <w:szCs w:val="24"/>
-        </w:rPr>
-        <w:t>, x=0 or 1</w:t>
-      </w:r>
-      <w:r>
-        <w:rPr>
-          <w:rFonts w:cstheme="minorHAnsi"/>
-          <w:sz w:val="24"/>
-          <w:szCs w:val="24"/>
-        </w:rPr>
-        <w:t xml:space="preserve"> once ‘normalised’</w:t>
-      </w:r>
-      <w:r>
-        <w:rPr>
-          <w:rFonts w:cstheme="minorHAnsi"/>
-          <w:sz w:val="24"/>
-          <w:szCs w:val="24"/>
-        </w:rPr>
-        <w:t>, and r=x.</w:t>
+        <w:t>p</w:t>
+      </w:r>
+      <w:r>
+        <w:rPr>
+          <w:rFonts w:cstheme="minorHAnsi"/>
+          <w:sz w:val="24"/>
+          <w:szCs w:val="24"/>
+        </w:rPr>
+        <w:t xml:space="preserve"> is of the form </w:t>
+      </w:r>
+      <w:r>
+        <w:rPr>
+          <w:rFonts w:cstheme="minorHAnsi"/>
+          <w:b/>
+          <w:bCs/>
+          <w:i/>
+          <w:iCs/>
+          <w:sz w:val="24"/>
+          <w:szCs w:val="24"/>
+        </w:rPr>
+        <w:t>4i+3</w:t>
+      </w:r>
+      <w:r>
+        <w:rPr>
+          <w:rFonts w:cstheme="minorHAnsi"/>
+          <w:sz w:val="24"/>
+          <w:szCs w:val="24"/>
+        </w:rPr>
+        <w:t xml:space="preserve"> use the Lagrange Formula to calculate the root</w:t>
+      </w:r>
+      <w:r>
+        <w:rPr>
+          <w:rFonts w:cstheme="minorHAnsi"/>
+          <w:sz w:val="24"/>
+          <w:szCs w:val="24"/>
+        </w:rPr>
+        <w:t>:</w:t>
       </w:r>
       <w:r>
         <w:rPr>
@@ -2365,44 +2718,12 @@
           <w:szCs w:val="24"/>
         </w:rPr>
         <w:br/>
-        <w:t xml:space="preserve">If the </w:t>
-      </w:r>
-      <w:r>
-        <w:rPr>
-          <w:rFonts w:cstheme="minorHAnsi"/>
-          <w:sz w:val="24"/>
-          <w:szCs w:val="24"/>
-        </w:rPr>
-        <w:t>Jacobi</w:t>
-      </w:r>
-      <w:r>
-        <w:rPr>
-          <w:rFonts w:cstheme="minorHAnsi"/>
-          <w:sz w:val="24"/>
-          <w:szCs w:val="24"/>
-        </w:rPr>
-        <w:t xml:space="preserve"> symbol (x/p) is not 1 there are no solutions.</w:t>
-      </w:r>
-    </w:p>
-    <w:p>
-      <w:pPr>
-        <w:rPr>
-          <w:rFonts w:cstheme="minorHAnsi"/>
-          <w:sz w:val="24"/>
-          <w:szCs w:val="24"/>
-        </w:rPr>
-      </w:pPr>
-      <w:r>
-        <w:rPr>
-          <w:rFonts w:cstheme="minorHAnsi"/>
-          <w:sz w:val="24"/>
-          <w:szCs w:val="24"/>
-        </w:rPr>
-        <w:t xml:space="preserve">If </w:t>
-      </w:r>
-      <w:r>
-        <w:rPr>
-          <w:rFonts w:cstheme="minorHAnsi"/>
+      </w:r>
+      <w:r>
+        <w:tab/>
+      </w:r>
+      <w:r>
+        <w:rPr>
           <w:b/>
           <w:bCs/>
           <w:i/>
@@ -2410,6 +2731,99 @@
           <w:sz w:val="24"/>
           <w:szCs w:val="24"/>
         </w:rPr>
+        <w:t>r ≡ ± x</w:t>
+      </w:r>
+      <w:r>
+        <w:rPr>
+          <w:b/>
+          <w:bCs/>
+          <w:i/>
+          <w:iCs/>
+          <w:sz w:val="24"/>
+          <w:szCs w:val="24"/>
+          <w:vertAlign w:val="superscript"/>
+        </w:rPr>
+        <w:t xml:space="preserve"> (p + </w:t>
+      </w:r>
+      <w:proofErr w:type="gramStart"/>
+      <w:r>
+        <w:rPr>
+          <w:b/>
+          <w:bCs/>
+          <w:i/>
+          <w:iCs/>
+          <w:sz w:val="24"/>
+          <w:szCs w:val="24"/>
+          <w:vertAlign w:val="superscript"/>
+        </w:rPr>
+        <w:t>1 )</w:t>
+      </w:r>
+      <w:proofErr w:type="gramEnd"/>
+      <w:r>
+        <w:rPr>
+          <w:b/>
+          <w:bCs/>
+          <w:i/>
+          <w:iCs/>
+          <w:sz w:val="24"/>
+          <w:szCs w:val="24"/>
+          <w:vertAlign w:val="superscript"/>
+        </w:rPr>
+        <w:t xml:space="preserve"> / 4</w:t>
+      </w:r>
+      <w:r>
+        <w:rPr>
+          <w:b/>
+          <w:bCs/>
+          <w:i/>
+          <w:iCs/>
+          <w:sz w:val="24"/>
+          <w:szCs w:val="24"/>
+        </w:rPr>
+        <w:t xml:space="preserve"> (mod p)</w:t>
+      </w:r>
+      <w:r>
+        <w:rPr>
+          <w:rFonts w:cstheme="minorHAnsi"/>
+          <w:b/>
+          <w:bCs/>
+          <w:i/>
+          <w:iCs/>
+          <w:sz w:val="24"/>
+          <w:szCs w:val="24"/>
+        </w:rPr>
+        <w:br/>
+      </w:r>
+      <w:r>
+        <w:rPr>
+          <w:rFonts w:cstheme="minorHAnsi"/>
+          <w:b/>
+          <w:bCs/>
+          <w:i/>
+          <w:iCs/>
+          <w:sz w:val="24"/>
+          <w:szCs w:val="24"/>
+        </w:rPr>
+        <w:br/>
+      </w:r>
+      <w:r>
+        <w:rPr>
+          <w:rFonts w:cstheme="minorHAnsi"/>
+          <w:sz w:val="24"/>
+          <w:szCs w:val="24"/>
+        </w:rPr>
+        <w:t xml:space="preserve">if </w:t>
+      </w:r>
+      <w:r>
+        <w:rPr>
+          <w:rFonts w:cstheme="minorHAnsi"/>
+          <w:b/>
+          <w:bCs/>
+          <w:i/>
+          <w:iCs/>
+          <w:sz w:val="24"/>
+          <w:szCs w:val="24"/>
+        </w:rPr>
         <w:t>p</w:t>
       </w:r>
       <w:r>
@@ -2430,72 +2844,380 @@
           <w:sz w:val="24"/>
           <w:szCs w:val="24"/>
         </w:rPr>
-        <w:t>4i+3</w:t>
-      </w:r>
-      <w:r>
-        <w:rPr>
-          <w:rFonts w:cstheme="minorHAnsi"/>
-          <w:sz w:val="24"/>
-          <w:szCs w:val="24"/>
-        </w:rPr>
-        <w:t xml:space="preserve"> use the Lagrange Formula to calculate the root.</w:t>
-      </w:r>
-      <w:r>
-        <w:rPr>
-          <w:rFonts w:cstheme="minorHAnsi"/>
+        <w:t>8i+5</w:t>
+      </w:r>
+      <w:r>
+        <w:rPr>
+          <w:rFonts w:cstheme="minorHAnsi"/>
+          <w:sz w:val="24"/>
+          <w:szCs w:val="24"/>
+        </w:rPr>
+        <w:t xml:space="preserve"> use the Legendre formula to calculate the root</w:t>
+      </w:r>
+      <w:r>
+        <w:rPr>
+          <w:rFonts w:cstheme="minorHAnsi"/>
+          <w:sz w:val="24"/>
+          <w:szCs w:val="24"/>
+        </w:rPr>
+        <w:t>:</w:t>
+      </w:r>
+    </w:p>
+    <w:p>
+      <w:pPr>
+        <w:spacing w:after="0"/>
+        <w:rPr>
+          <w:sz w:val="24"/>
+          <w:szCs w:val="24"/>
+        </w:rPr>
+      </w:pPr>
+      <w:r>
+        <w:tab/>
+      </w:r>
+      <w:r>
+        <w:rPr>
+          <w:sz w:val="24"/>
+          <w:szCs w:val="24"/>
+        </w:rPr>
+        <w:t xml:space="preserve">r </w:t>
+      </w:r>
+      <w:proofErr w:type="gramStart"/>
+      <w:r>
+        <w:rPr>
+          <w:sz w:val="24"/>
+          <w:szCs w:val="24"/>
+        </w:rPr>
+        <w:t>≡  ±</w:t>
+      </w:r>
+      <w:proofErr w:type="gramEnd"/>
+      <w:r>
+        <w:rPr>
+          <w:sz w:val="24"/>
+          <w:szCs w:val="24"/>
+        </w:rPr>
+        <w:t xml:space="preserve"> x</w:t>
+      </w:r>
+      <w:r>
+        <w:rPr>
+          <w:sz w:val="24"/>
+          <w:szCs w:val="24"/>
+          <w:vertAlign w:val="superscript"/>
+        </w:rPr>
+        <w:t xml:space="preserve"> ( p + 3 ) / 8</w:t>
+      </w:r>
+      <w:r>
+        <w:rPr>
+          <w:sz w:val="24"/>
+          <w:szCs w:val="24"/>
+        </w:rPr>
+        <w:t xml:space="preserve">                  (mod p )    if  x  is a quartic residue modulo  p , </w:t>
+      </w:r>
+    </w:p>
+    <w:p>
+      <w:r>
+        <w:rPr>
+          <w:sz w:val="24"/>
+          <w:szCs w:val="24"/>
+        </w:rPr>
+        <w:tab/>
+        <w:t xml:space="preserve">r </w:t>
+      </w:r>
+      <w:proofErr w:type="gramStart"/>
+      <w:r>
+        <w:rPr>
+          <w:sz w:val="24"/>
+          <w:szCs w:val="24"/>
+        </w:rPr>
+        <w:t>≡  ±</w:t>
+      </w:r>
+      <w:proofErr w:type="gramEnd"/>
+      <w:r>
+        <w:rPr>
+          <w:sz w:val="24"/>
+          <w:szCs w:val="24"/>
+        </w:rPr>
+        <w:t xml:space="preserve"> x </w:t>
+      </w:r>
+      <w:r>
+        <w:rPr>
+          <w:sz w:val="24"/>
+          <w:szCs w:val="24"/>
+          <w:vertAlign w:val="superscript"/>
+        </w:rPr>
+        <w:t>( p + 3 ) / 8</w:t>
+      </w:r>
+      <w:r>
+        <w:rPr>
+          <w:sz w:val="24"/>
+          <w:szCs w:val="24"/>
+        </w:rPr>
+        <w:t xml:space="preserve"> 2 </w:t>
+      </w:r>
+      <w:r>
+        <w:rPr>
+          <w:sz w:val="24"/>
+          <w:szCs w:val="24"/>
+          <w:vertAlign w:val="superscript"/>
+        </w:rPr>
+        <w:t>( p − 1 ) / 4</w:t>
+      </w:r>
+      <w:r>
+        <w:rPr>
+          <w:sz w:val="24"/>
+          <w:szCs w:val="24"/>
+        </w:rPr>
+        <w:t xml:space="preserve"> (mod p )    if  x  is a quartic non-residue modulo  p</w:t>
+      </w:r>
+      <w:r>
+        <w:t xml:space="preserve"> . </w:t>
+      </w:r>
+    </w:p>
+    <w:p>
+      <w:pPr>
+        <w:rPr>
+          <w:rFonts w:cstheme="minorHAnsi"/>
+          <w:sz w:val="24"/>
+          <w:szCs w:val="24"/>
+        </w:rPr>
+      </w:pPr>
+      <w:r>
+        <w:rPr>
+          <w:sz w:val="24"/>
+          <w:szCs w:val="24"/>
+        </w:rPr>
+        <w:t xml:space="preserve">Claim: A residue </w:t>
+      </w:r>
+      <w:r>
+        <w:rPr>
+          <w:rStyle w:val="mi"/>
+          <w:rFonts w:cstheme="minorHAnsi"/>
+          <w:i/>
+          <w:iCs/>
+          <w:sz w:val="24"/>
+          <w:szCs w:val="24"/>
+        </w:rPr>
+        <w:t>x</w:t>
+      </w:r>
+      <w:r>
+        <w:rPr>
+          <w:sz w:val="24"/>
+          <w:szCs w:val="24"/>
+        </w:rPr>
+        <w:t xml:space="preserve"> is a quartic residue if and only if </w:t>
+      </w:r>
+      <w:r>
+        <w:rPr>
+          <w:rStyle w:val="mi"/>
+          <w:rFonts w:cstheme="minorHAnsi"/>
+          <w:i/>
+          <w:iCs/>
+          <w:sz w:val="24"/>
+          <w:szCs w:val="24"/>
+        </w:rPr>
+        <w:t>x</w:t>
+      </w:r>
+      <w:r>
+        <w:rPr>
+          <w:rStyle w:val="mi"/>
+          <w:rFonts w:cstheme="minorHAnsi"/>
+          <w:i/>
+          <w:iCs/>
+          <w:sz w:val="24"/>
+          <w:szCs w:val="24"/>
+          <w:vertAlign w:val="superscript"/>
+        </w:rPr>
+        <w:t xml:space="preserve">(p-1)/4 </w:t>
+      </w:r>
+      <w:r>
+        <w:rPr>
+          <w:rStyle w:val="mo"/>
+          <w:rFonts w:cstheme="minorHAnsi"/>
+          <w:b/>
+          <w:bCs/>
+          <w:sz w:val="24"/>
+          <w:szCs w:val="24"/>
+        </w:rPr>
+        <w:t xml:space="preserve">≡ </w:t>
+      </w:r>
+      <w:r>
+        <w:rPr>
+          <w:rStyle w:val="mn"/>
+          <w:rFonts w:cstheme="minorHAnsi"/>
+          <w:b/>
+          <w:bCs/>
+          <w:sz w:val="24"/>
+          <w:szCs w:val="24"/>
+        </w:rPr>
+        <w:t xml:space="preserve">1 </w:t>
+      </w:r>
+      <w:r>
+        <w:rPr>
+          <w:rStyle w:val="mo"/>
+          <w:rFonts w:cstheme="minorHAnsi"/>
+          <w:b/>
+          <w:bCs/>
+          <w:sz w:val="24"/>
+          <w:szCs w:val="24"/>
+        </w:rPr>
+        <w:t>(</w:t>
+      </w:r>
+      <w:r>
+        <w:rPr>
+          <w:rStyle w:val="mi"/>
+          <w:rFonts w:cstheme="minorHAnsi"/>
+          <w:sz w:val="24"/>
+          <w:szCs w:val="24"/>
+        </w:rPr>
+        <w:t xml:space="preserve">mod </w:t>
+      </w:r>
+      <w:r>
+        <w:rPr>
+          <w:rStyle w:val="mi"/>
+          <w:rFonts w:cstheme="minorHAnsi"/>
+          <w:i/>
+          <w:iCs/>
+          <w:sz w:val="24"/>
+          <w:szCs w:val="24"/>
+        </w:rPr>
+        <w:t>p</w:t>
+      </w:r>
+      <w:r>
+        <w:rPr>
+          <w:rStyle w:val="mo"/>
+          <w:rFonts w:cstheme="minorHAnsi"/>
+          <w:b/>
+          <w:bCs/>
+          <w:sz w:val="24"/>
+          <w:szCs w:val="24"/>
+        </w:rPr>
+        <w:t>)</w:t>
+      </w:r>
+    </w:p>
+    <w:p>
+      <w:pPr>
+        <w:rPr>
+          <w:sz w:val="24"/>
+          <w:szCs w:val="24"/>
+        </w:rPr>
+      </w:pPr>
+      <w:r>
+        <w:rPr>
+          <w:sz w:val="24"/>
+          <w:szCs w:val="24"/>
+        </w:rPr>
+        <w:t xml:space="preserve">A more practical method is (don’t need to know if </w:t>
+      </w:r>
+      <w:r>
+        <w:rPr>
+          <w:b/>
+          <w:bCs/>
+          <w:i/>
+          <w:iCs/>
+          <w:sz w:val="24"/>
+          <w:szCs w:val="24"/>
+        </w:rPr>
+        <w:t>x</w:t>
+      </w:r>
+      <w:r>
+        <w:rPr>
+          <w:sz w:val="24"/>
+          <w:szCs w:val="24"/>
+        </w:rPr>
+        <w:t xml:space="preserve"> is quartic residue):</w:t>
+      </w:r>
+    </w:p>
+    <w:p>
+      <w:pPr>
+        <w:spacing w:after="240"/>
+        <w:rPr>
+          <w:sz w:val="24"/>
+          <w:szCs w:val="24"/>
+        </w:rPr>
+      </w:pPr>
+      <w:r>
+        <w:rPr>
+          <w:sz w:val="24"/>
+          <w:szCs w:val="24"/>
+        </w:rPr>
+        <w:t>v = 2x</w:t>
+      </w:r>
+      <w:r>
+        <w:rPr>
+          <w:sz w:val="24"/>
+          <w:szCs w:val="24"/>
+          <w:vertAlign w:val="superscript"/>
+        </w:rPr>
+        <w:t>(p-5)/8</w:t>
+      </w:r>
+      <w:r>
+        <w:rPr>
+          <w:sz w:val="24"/>
+          <w:szCs w:val="24"/>
+        </w:rPr>
+        <w:t xml:space="preserve"> </w:t>
+      </w:r>
+      <w:proofErr w:type="gramStart"/>
+      <w:r>
+        <w:rPr>
+          <w:sz w:val="24"/>
+          <w:szCs w:val="24"/>
+        </w:rPr>
+        <w:t xml:space="preserve">   (</w:t>
+      </w:r>
+      <w:proofErr w:type="gramEnd"/>
+      <w:r>
+        <w:rPr>
+          <w:sz w:val="24"/>
+          <w:szCs w:val="24"/>
+        </w:rPr>
+        <w:t>mod p)</w:t>
+      </w:r>
+      <w:r>
+        <w:rPr>
           <w:sz w:val="24"/>
           <w:szCs w:val="24"/>
         </w:rPr>
         <w:br/>
-        <w:t xml:space="preserve">if </w:t>
-      </w:r>
-      <w:r>
-        <w:rPr>
-          <w:rFonts w:cstheme="minorHAnsi"/>
-          <w:b/>
-          <w:bCs/>
-          <w:i/>
-          <w:iCs/>
-          <w:sz w:val="24"/>
-          <w:szCs w:val="24"/>
-        </w:rPr>
-        <w:t>p</w:t>
-      </w:r>
-      <w:r>
-        <w:rPr>
-          <w:rFonts w:cstheme="minorHAnsi"/>
-          <w:sz w:val="24"/>
-          <w:szCs w:val="24"/>
-        </w:rPr>
-        <w:t xml:space="preserve"> is of the form </w:t>
-      </w:r>
-      <w:r>
-        <w:rPr>
-          <w:rFonts w:cstheme="minorHAnsi"/>
-          <w:b/>
-          <w:bCs/>
-          <w:i/>
-          <w:iCs/>
-          <w:sz w:val="24"/>
-          <w:szCs w:val="24"/>
-        </w:rPr>
-        <w:t>8i+5</w:t>
-      </w:r>
-      <w:r>
-        <w:rPr>
-          <w:rFonts w:cstheme="minorHAnsi"/>
-          <w:sz w:val="24"/>
-          <w:szCs w:val="24"/>
-        </w:rPr>
-        <w:t xml:space="preserve"> use the Legendre formula to calculate the root</w:t>
-      </w:r>
-      <w:r>
-        <w:rPr>
-          <w:rFonts w:cstheme="minorHAnsi"/>
+        <w:t>i = 2xv</w:t>
+      </w:r>
+      <w:r>
+        <w:rPr>
+          <w:sz w:val="24"/>
+          <w:szCs w:val="24"/>
+          <w:vertAlign w:val="superscript"/>
+        </w:rPr>
+        <w:t>2</w:t>
+      </w:r>
+      <w:r>
+        <w:rPr>
+          <w:sz w:val="24"/>
+          <w:szCs w:val="24"/>
+        </w:rPr>
+        <w:t xml:space="preserve">          (mod p)</w:t>
+      </w:r>
+      <w:r>
+        <w:rPr>
           <w:sz w:val="24"/>
           <w:szCs w:val="24"/>
         </w:rPr>
         <w:br/>
+        <w:t>r =  ±xv (i-1) (mod p)</w:t>
+      </w:r>
+    </w:p>
+    <w:p>
+      <w:pPr>
+        <w:rPr>
+          <w:rFonts w:cstheme="minorHAnsi"/>
+          <w:sz w:val="24"/>
+          <w:szCs w:val="24"/>
+        </w:rPr>
+      </w:pPr>
+      <w:r>
+        <w:rPr>
+          <w:rFonts w:cstheme="minorHAnsi"/>
+          <w:sz w:val="24"/>
+          <w:szCs w:val="24"/>
+        </w:rPr>
         <w:t xml:space="preserve">If </w:t>
       </w:r>
       <w:r>
@@ -3149,6 +3871,7 @@
         </w:rPr>
         <w:t xml:space="preserve"> </w:t>
       </w:r>
+      <w:proofErr w:type="gramStart"/>
       <w:r>
         <w:rPr>
           <w:rFonts w:cstheme="minorHAnsi"/>
@@ -3188,7 +3911,16 @@
           <w:sz w:val="24"/>
           <w:szCs w:val="24"/>
         </w:rPr>
-        <w:t xml:space="preserve">, and find the roots of </w:t>
+        <w:t>,</w:t>
+      </w:r>
+      <w:proofErr w:type="gramEnd"/>
+      <w:r>
+        <w:rPr>
+          <w:rFonts w:cstheme="minorHAnsi"/>
+          <w:sz w:val="24"/>
+          <w:szCs w:val="24"/>
+        </w:rPr>
+        <w:t xml:space="preserve"> and find the roots of </w:t>
       </w:r>
       <w:r>
         <w:rPr>
@@ -3495,7 +4227,25 @@
           <w:sz w:val="24"/>
           <w:szCs w:val="24"/>
         </w:rPr>
-        <w:t xml:space="preserve">(any or all of the roots found could be used but we actually only need one.) </w:t>
+        <w:t>(</w:t>
+      </w:r>
+      <w:proofErr w:type="gramStart"/>
+      <w:r>
+        <w:rPr>
+          <w:rFonts w:cstheme="minorHAnsi"/>
+          <w:sz w:val="24"/>
+          <w:szCs w:val="24"/>
+        </w:rPr>
+        <w:t>any</w:t>
+      </w:r>
+      <w:proofErr w:type="gramEnd"/>
+      <w:r>
+        <w:rPr>
+          <w:rFonts w:cstheme="minorHAnsi"/>
+          <w:sz w:val="24"/>
+          <w:szCs w:val="24"/>
+        </w:rPr>
+        <w:t xml:space="preserve"> or all of the roots found could be used but we actually only need one.) </w:t>
       </w:r>
       <w:r>
         <w:rPr>
@@ -3860,6 +4610,7 @@
         </w:rPr>
         <w:t xml:space="preserve"> </w:t>
       </w:r>
+      <w:proofErr w:type="gramStart"/>
       <w:r>
         <w:rPr>
           <w:rFonts w:cstheme="minorHAnsi"/>
@@ -3884,7 +4635,18 @@
           <w:sz w:val="24"/>
           <w:szCs w:val="24"/>
         </w:rPr>
-        <w:t>increment = max (</w:t>
+        <w:t>increment</w:t>
+      </w:r>
+      <w:proofErr w:type="gramEnd"/>
+      <w:r>
+        <w:rPr>
+          <w:rFonts w:cstheme="minorHAnsi"/>
+          <w:b/>
+          <w:i/>
+          <w:sz w:val="24"/>
+          <w:szCs w:val="24"/>
+        </w:rPr>
+        <w:t xml:space="preserve"> = max (</w:t>
       </w:r>
       <w:r>
         <w:rPr>
@@ -4259,17 +5021,37 @@
           <w:sz w:val="24"/>
           <w:szCs w:val="24"/>
         </w:rPr>
-        <w:t xml:space="preserve"> let  </w:t>
-      </w:r>
-      <w:r>
-        <w:rPr>
-          <w:rFonts w:cstheme="minorHAnsi"/>
-          <w:b/>
-          <w:i/>
-          <w:sz w:val="24"/>
-          <w:szCs w:val="24"/>
-        </w:rPr>
-        <w:t xml:space="preserve">increment = </w:t>
+        <w:t xml:space="preserve"> </w:t>
+      </w:r>
+      <w:proofErr w:type="gramStart"/>
+      <w:r>
+        <w:rPr>
+          <w:rFonts w:cstheme="minorHAnsi"/>
+          <w:sz w:val="24"/>
+          <w:szCs w:val="24"/>
+        </w:rPr>
+        <w:t xml:space="preserve">let  </w:t>
+      </w:r>
+      <w:r>
+        <w:rPr>
+          <w:rFonts w:cstheme="minorHAnsi"/>
+          <w:b/>
+          <w:i/>
+          <w:sz w:val="24"/>
+          <w:szCs w:val="24"/>
+        </w:rPr>
+        <w:t>increment</w:t>
+      </w:r>
+      <w:proofErr w:type="gramEnd"/>
+      <w:r>
+        <w:rPr>
+          <w:rFonts w:cstheme="minorHAnsi"/>
+          <w:b/>
+          <w:i/>
+          <w:sz w:val="24"/>
+          <w:szCs w:val="24"/>
+        </w:rPr>
+        <w:t xml:space="preserve"> = </w:t>
       </w:r>
       <w:r>
         <w:rPr>
@@ -4352,6 +5134,7 @@
           <w:sz w:val="24"/>
           <w:szCs w:val="24"/>
         </w:rPr>
+        <w:lastRenderedPageBreak/>
         <w:t>The 1</w:t>
       </w:r>
       <w:r>
@@ -4444,6 +5227,7 @@
         </w:rPr>
         <w:t xml:space="preserve"> + 2 × increment, … </w:t>
       </w:r>
+      <w:proofErr w:type="gramStart"/>
       <w:r>
         <w:rPr>
           <w:rFonts w:cstheme="minorHAnsi"/>
@@ -4470,6 +5254,7 @@
         </w:rPr>
         <w:t>r</w:t>
       </w:r>
+      <w:proofErr w:type="gramEnd"/>
       <w:r>
         <w:rPr>
           <w:rFonts w:cstheme="minorHAnsi"/>
@@ -4681,7 +5466,7 @@
           <w:sz w:val="24"/>
           <w:szCs w:val="24"/>
         </w:rPr>
-        <w:t xml:space="preserve">roots  by multiplying </w:t>
+        <w:t xml:space="preserve">roots by multiplying </w:t>
       </w:r>
       <w:r>
         <w:rPr>
@@ -4866,11 +5651,19 @@
         </w:rPr>
         <w:t xml:space="preserve">, </w:t>
       </w:r>
+      <w:proofErr w:type="gramStart"/>
       <w:r>
         <w:rPr>
           <w:highlight w:val="white"/>
         </w:rPr>
-        <w:t>gcd(x, p^</w:t>
+        <w:t>gcd(</w:t>
+      </w:r>
+      <w:proofErr w:type="gramEnd"/>
+      <w:r>
+        <w:rPr>
+          <w:highlight w:val="white"/>
+        </w:rPr>
+        <w:t>x, p^</w:t>
       </w:r>
       <w:r>
         <w:rPr>
@@ -4970,7 +5763,25 @@
           <w:sz w:val="24"/>
           <w:szCs w:val="24"/>
         </w:rPr>
-        <w:t xml:space="preserve"> (i.e. </w:t>
+        <w:t xml:space="preserve"> (</w:t>
+      </w:r>
+      <w:proofErr w:type="gramStart"/>
+      <w:r>
+        <w:rPr>
+          <w:rFonts w:cstheme="minorHAnsi"/>
+          <w:sz w:val="24"/>
+          <w:szCs w:val="24"/>
+        </w:rPr>
+        <w:t>i.e.</w:t>
+      </w:r>
+      <w:proofErr w:type="gramEnd"/>
+      <w:r>
+        <w:rPr>
+          <w:rFonts w:cstheme="minorHAnsi"/>
+          <w:sz w:val="24"/>
+          <w:szCs w:val="24"/>
+        </w:rPr>
+        <w:t xml:space="preserve"> </w:t>
       </w:r>
       <w:r>
         <w:rPr>
@@ -5360,6 +6171,7 @@
         </w:rPr>
         <w:t>r</w:t>
       </w:r>
+      <w:proofErr w:type="gramStart"/>
       <w:r>
         <w:rPr>
           <w:rFonts w:cstheme="minorHAnsi"/>
@@ -5379,7 +6191,18 @@
           <w:sz w:val="24"/>
           <w:szCs w:val="24"/>
         </w:rPr>
-        <w:t>= p</w:t>
+        <w:t>=</w:t>
+      </w:r>
+      <w:proofErr w:type="gramEnd"/>
+      <w:r>
+        <w:rPr>
+          <w:rFonts w:cstheme="minorHAnsi"/>
+          <w:b/>
+          <w:i/>
+          <w:sz w:val="24"/>
+          <w:szCs w:val="24"/>
+        </w:rPr>
+        <w:t xml:space="preserve"> p</w:t>
       </w:r>
       <w:r>
         <w:rPr>
@@ -5562,18 +6385,43 @@
           <w:vertAlign w:val="superscript"/>
           <w:lang w:val="pt-PT"/>
         </w:rPr>
-        <w:t>i-1</w:t>
-      </w:r>
-      <w:r>
-        <w:rPr>
-          <w:rFonts w:cstheme="minorHAnsi"/>
-          <w:b/>
-          <w:i/>
-          <w:sz w:val="24"/>
-          <w:szCs w:val="24"/>
+        <w:t>i-</w:t>
+      </w:r>
+      <w:proofErr w:type="gramStart"/>
+      <w:r>
+        <w:rPr>
+          <w:rFonts w:cstheme="minorHAnsi"/>
+          <w:b/>
+          <w:i/>
+          <w:sz w:val="24"/>
+          <w:szCs w:val="24"/>
+          <w:vertAlign w:val="superscript"/>
           <w:lang w:val="pt-PT"/>
         </w:rPr>
-        <w:t>,     r</w:t>
+        <w:t>1</w:t>
+      </w:r>
+      <w:r>
+        <w:rPr>
+          <w:rFonts w:cstheme="minorHAnsi"/>
+          <w:b/>
+          <w:i/>
+          <w:sz w:val="24"/>
+          <w:szCs w:val="24"/>
+          <w:lang w:val="pt-PT"/>
+        </w:rPr>
+        <w:t xml:space="preserve">,   </w:t>
+      </w:r>
+      <w:proofErr w:type="gramEnd"/>
+      <w:r>
+        <w:rPr>
+          <w:rFonts w:cstheme="minorHAnsi"/>
+          <w:b/>
+          <w:i/>
+          <w:sz w:val="24"/>
+          <w:szCs w:val="24"/>
+          <w:lang w:val="pt-PT"/>
+        </w:rPr>
+        <w:t xml:space="preserve">  r</w:t>
       </w:r>
       <w:r>
         <w:rPr>
@@ -5749,6 +6597,7 @@
         </w:rPr>
         <w:t xml:space="preserve"> = r</w:t>
       </w:r>
+      <w:proofErr w:type="gramStart"/>
       <w:r>
         <w:rPr>
           <w:rFonts w:cstheme="minorHAnsi"/>
@@ -5770,7 +6619,19 @@
           <w:szCs w:val="24"/>
           <w:lang w:val="pt-PT"/>
         </w:rPr>
-        <w:t xml:space="preserve">  - p</w:t>
+        <w:t xml:space="preserve">  -</w:t>
+      </w:r>
+      <w:proofErr w:type="gramEnd"/>
+      <w:r>
+        <w:rPr>
+          <w:rFonts w:cstheme="minorHAnsi"/>
+          <w:b/>
+          <w:i/>
+          <w:sz w:val="24"/>
+          <w:szCs w:val="24"/>
+          <w:lang w:val="pt-PT"/>
+        </w:rPr>
+        <w:t xml:space="preserve"> p</w:t>
       </w:r>
       <w:r>
         <w:rPr>
@@ -5870,7 +6731,6 @@
           <w:szCs w:val="24"/>
           <w:highlight w:val="white"/>
         </w:rPr>
-        <w:lastRenderedPageBreak/>
         <w:t>2.7.</w:t>
       </w:r>
       <w:r>
@@ -5925,13 +6785,23 @@
         </w:rPr>
         <w:t xml:space="preserve">, </w:t>
       </w:r>
+      <w:proofErr w:type="gramStart"/>
       <w:r>
         <w:rPr>
           <w:sz w:val="24"/>
           <w:szCs w:val="24"/>
           <w:highlight w:val="white"/>
         </w:rPr>
-        <w:t>gcd(x, p^i) = 1, p &gt; 2</w:t>
+        <w:t>gcd(</w:t>
+      </w:r>
+      <w:proofErr w:type="gramEnd"/>
+      <w:r>
+        <w:rPr>
+          <w:sz w:val="24"/>
+          <w:szCs w:val="24"/>
+          <w:highlight w:val="white"/>
+        </w:rPr>
+        <w:t>x, p^i) = 1, p &gt; 2</w:t>
       </w:r>
       <w:r>
         <w:rPr>
@@ -5957,6 +6827,7 @@
           <w:szCs w:val="24"/>
         </w:rPr>
       </w:pPr>
+      <w:proofErr w:type="gramStart"/>
       <w:r>
         <w:rPr>
           <w:rFonts w:cstheme="minorHAnsi"/>
@@ -5975,6 +6846,7 @@
         </w:rPr>
         <w:t>r</w:t>
       </w:r>
+      <w:proofErr w:type="gramEnd"/>
       <w:r>
         <w:rPr>
           <w:rFonts w:cstheme="minorHAnsi"/>
@@ -6279,7 +7151,16 @@
           <w:sz w:val="24"/>
           <w:szCs w:val="24"/>
         </w:rPr>
-        <w:t xml:space="preserve"> such that  </w:t>
+        <w:t xml:space="preserve"> such </w:t>
+      </w:r>
+      <w:proofErr w:type="gramStart"/>
+      <w:r>
+        <w:rPr>
+          <w:rFonts w:cstheme="minorHAnsi"/>
+          <w:sz w:val="24"/>
+          <w:szCs w:val="24"/>
+        </w:rPr>
+        <w:t xml:space="preserve">that  </w:t>
       </w:r>
       <w:r>
         <w:rPr>
@@ -6291,6 +7172,7 @@
         </w:rPr>
         <w:t>r</w:t>
       </w:r>
+      <w:proofErr w:type="gramEnd"/>
       <w:r>
         <w:rPr>
           <w:rFonts w:cstheme="minorHAnsi"/>
@@ -7048,25 +7930,25 @@
           <w:sz w:val="20"/>
           <w:szCs w:val="24"/>
         </w:rPr>
-        <w:t xml:space="preserve">                for k in xrange(3, e):</w:t>
-      </w:r>
-    </w:p>
-    <w:p>
-      <w:pPr>
-        <w:spacing w:after="0"/>
+        <w:t xml:space="preserve">                for k in </w:t>
+      </w:r>
+      <w:proofErr w:type="gramStart"/>
+      <w:r>
         <w:rPr>
           <w:rFonts w:ascii="Lucida Console" w:hAnsi="Lucida Console" w:cstheme="minorHAnsi"/>
           <w:sz w:val="20"/>
           <w:szCs w:val="24"/>
         </w:rPr>
-      </w:pPr>
+        <w:t>xrange(</w:t>
+      </w:r>
+      <w:proofErr w:type="gramEnd"/>
       <w:r>
         <w:rPr>
           <w:rFonts w:ascii="Lucida Console" w:hAnsi="Lucida Console" w:cstheme="minorHAnsi"/>
           <w:sz w:val="20"/>
           <w:szCs w:val="24"/>
         </w:rPr>
-        <w:t xml:space="preserve">                    i = (x*x - a)/(2**k) % 2</w:t>
+        <w:t>3, e):</w:t>
       </w:r>
     </w:p>
     <w:p>
@@ -7084,7 +7966,7 @@
           <w:sz w:val="20"/>
           <w:szCs w:val="24"/>
         </w:rPr>
-        <w:t xml:space="preserve">                    x = x + i*2**(k-1)</w:t>
+        <w:t xml:space="preserve">                    i = (x*x - a)/(2**k) % 2</w:t>
       </w:r>
     </w:p>
     <w:p>
@@ -7102,7 +7984,7 @@
           <w:sz w:val="20"/>
           <w:szCs w:val="24"/>
         </w:rPr>
-        <w:t xml:space="preserve">                res.append(x)</w:t>
+        <w:t xml:space="preserve">                    x = x + i*2**(k-1)</w:t>
       </w:r>
     </w:p>
     <w:p>
@@ -7120,25 +8002,26 @@
           <w:sz w:val="20"/>
           <w:szCs w:val="24"/>
         </w:rPr>
-        <w:t xml:space="preserve">                res.append(p**e - x)</w:t>
-      </w:r>
-    </w:p>
-    <w:p>
-      <w:pPr>
-        <w:spacing w:after="0"/>
+        <w:lastRenderedPageBreak/>
+        <w:t xml:space="preserve">                </w:t>
+      </w:r>
+      <w:proofErr w:type="gramStart"/>
+      <w:r>
         <w:rPr>
           <w:rFonts w:ascii="Lucida Console" w:hAnsi="Lucida Console" w:cstheme="minorHAnsi"/>
           <w:sz w:val="20"/>
           <w:szCs w:val="24"/>
         </w:rPr>
-      </w:pPr>
+        <w:t>res.append</w:t>
+      </w:r>
+      <w:proofErr w:type="gramEnd"/>
       <w:r>
         <w:rPr>
           <w:rFonts w:ascii="Lucida Console" w:hAnsi="Lucida Console" w:cstheme="minorHAnsi"/>
           <w:sz w:val="20"/>
           <w:szCs w:val="24"/>
         </w:rPr>
-        <w:t xml:space="preserve">            return res</w:t>
+        <w:t>(x)</w:t>
       </w:r>
     </w:p>
     <w:p>
@@ -7156,25 +8039,25 @@
           <w:sz w:val="20"/>
           <w:szCs w:val="24"/>
         </w:rPr>
-        <w:t xml:space="preserve">        # No solution if a is odd and a % 8 != 1</w:t>
-      </w:r>
-    </w:p>
-    <w:p>
-      <w:pPr>
-        <w:spacing w:after="0"/>
+        <w:t xml:space="preserve">                </w:t>
+      </w:r>
+      <w:proofErr w:type="gramStart"/>
+      <w:r>
         <w:rPr>
           <w:rFonts w:ascii="Lucida Console" w:hAnsi="Lucida Console" w:cstheme="minorHAnsi"/>
           <w:sz w:val="20"/>
           <w:szCs w:val="24"/>
         </w:rPr>
-      </w:pPr>
+        <w:t>res.append</w:t>
+      </w:r>
+      <w:proofErr w:type="gramEnd"/>
       <w:r>
         <w:rPr>
           <w:rFonts w:ascii="Lucida Console" w:hAnsi="Lucida Console" w:cstheme="minorHAnsi"/>
           <w:sz w:val="20"/>
           <w:szCs w:val="24"/>
         </w:rPr>
-        <w:t xml:space="preserve">        if e &gt;= 3 and a % 2 == 1:</w:t>
+        <w:t>(p**e - x)</w:t>
       </w:r>
     </w:p>
     <w:p>
@@ -7192,7 +8075,7 @@
           <w:sz w:val="20"/>
           <w:szCs w:val="24"/>
         </w:rPr>
-        <w:t xml:space="preserve">            return []</w:t>
+        <w:t xml:space="preserve">            return res</w:t>
       </w:r>
     </w:p>
     <w:p>
@@ -7210,25 +8093,115 @@
           <w:sz w:val="20"/>
           <w:szCs w:val="24"/>
         </w:rPr>
-        <w:t xml:space="preserve">        # Force brut if a is even or e &lt; 3 (for now)</w:t>
-      </w:r>
-    </w:p>
-    <w:p>
-      <w:pPr>
-        <w:spacing w:after="0"/>
+        <w:t xml:space="preserve">        # No solution if a is odd and a % </w:t>
+      </w:r>
+      <w:proofErr w:type="gramStart"/>
+      <w:r>
         <w:rPr>
           <w:rFonts w:ascii="Lucida Console" w:hAnsi="Lucida Console" w:cstheme="minorHAnsi"/>
           <w:sz w:val="20"/>
           <w:szCs w:val="24"/>
         </w:rPr>
-      </w:pPr>
+        <w:t>8 !</w:t>
+      </w:r>
+      <w:proofErr w:type="gramEnd"/>
       <w:r>
         <w:rPr>
           <w:rFonts w:ascii="Lucida Console" w:hAnsi="Lucida Console" w:cstheme="minorHAnsi"/>
           <w:sz w:val="20"/>
           <w:szCs w:val="24"/>
         </w:rPr>
-        <w:t xml:space="preserve">        return [x for x in xrange(0, p**e) if x*x % p**e == a % p**e]</w:t>
+        <w:t>= 1</w:t>
+      </w:r>
+    </w:p>
+    <w:p>
+      <w:pPr>
+        <w:spacing w:after="0"/>
+        <w:rPr>
+          <w:rFonts w:ascii="Lucida Console" w:hAnsi="Lucida Console" w:cstheme="minorHAnsi"/>
+          <w:sz w:val="20"/>
+          <w:szCs w:val="24"/>
+        </w:rPr>
+      </w:pPr>
+      <w:r>
+        <w:rPr>
+          <w:rFonts w:ascii="Lucida Console" w:hAnsi="Lucida Console" w:cstheme="minorHAnsi"/>
+          <w:sz w:val="20"/>
+          <w:szCs w:val="24"/>
+        </w:rPr>
+        <w:t xml:space="preserve">        if e &gt;= 3 and a % 2 == 1:</w:t>
+      </w:r>
+    </w:p>
+    <w:p>
+      <w:pPr>
+        <w:spacing w:after="0"/>
+        <w:rPr>
+          <w:rFonts w:ascii="Lucida Console" w:hAnsi="Lucida Console" w:cstheme="minorHAnsi"/>
+          <w:sz w:val="20"/>
+          <w:szCs w:val="24"/>
+        </w:rPr>
+      </w:pPr>
+      <w:r>
+        <w:rPr>
+          <w:rFonts w:ascii="Lucida Console" w:hAnsi="Lucida Console" w:cstheme="minorHAnsi"/>
+          <w:sz w:val="20"/>
+          <w:szCs w:val="24"/>
+        </w:rPr>
+        <w:t xml:space="preserve">            return []</w:t>
+      </w:r>
+    </w:p>
+    <w:p>
+      <w:pPr>
+        <w:spacing w:after="0"/>
+        <w:rPr>
+          <w:rFonts w:ascii="Lucida Console" w:hAnsi="Lucida Console" w:cstheme="minorHAnsi"/>
+          <w:sz w:val="20"/>
+          <w:szCs w:val="24"/>
+        </w:rPr>
+      </w:pPr>
+      <w:r>
+        <w:rPr>
+          <w:rFonts w:ascii="Lucida Console" w:hAnsi="Lucida Console" w:cstheme="minorHAnsi"/>
+          <w:sz w:val="20"/>
+          <w:szCs w:val="24"/>
+        </w:rPr>
+        <w:t xml:space="preserve">        # Force brut if a is even or e &lt; 3 (for now)</w:t>
+      </w:r>
+    </w:p>
+    <w:p>
+      <w:pPr>
+        <w:spacing w:after="0"/>
+        <w:rPr>
+          <w:rFonts w:ascii="Lucida Console" w:hAnsi="Lucida Console" w:cstheme="minorHAnsi"/>
+          <w:sz w:val="20"/>
+          <w:szCs w:val="24"/>
+        </w:rPr>
+      </w:pPr>
+      <w:r>
+        <w:rPr>
+          <w:rFonts w:ascii="Lucida Console" w:hAnsi="Lucida Console" w:cstheme="minorHAnsi"/>
+          <w:sz w:val="20"/>
+          <w:szCs w:val="24"/>
+        </w:rPr>
+        <w:t xml:space="preserve">        return [x for x in </w:t>
+      </w:r>
+      <w:proofErr w:type="gramStart"/>
+      <w:r>
+        <w:rPr>
+          <w:rFonts w:ascii="Lucida Console" w:hAnsi="Lucida Console" w:cstheme="minorHAnsi"/>
+          <w:sz w:val="20"/>
+          <w:szCs w:val="24"/>
+        </w:rPr>
+        <w:t>xrange(</w:t>
+      </w:r>
+      <w:proofErr w:type="gramEnd"/>
+      <w:r>
+        <w:rPr>
+          <w:rFonts w:ascii="Lucida Console" w:hAnsi="Lucida Console" w:cstheme="minorHAnsi"/>
+          <w:sz w:val="20"/>
+          <w:szCs w:val="24"/>
+        </w:rPr>
+        <w:t>0, p**e) if x*x % p**e == a % p**e]</w:t>
       </w:r>
     </w:p>
     <w:p>
@@ -7459,8 +8432,9 @@
           <w:sz w:val="19"/>
           <w:szCs w:val="19"/>
         </w:rPr>
-        <w:t xml:space="preserve"> 1;</w:t>
-      </w:r>
+        <w:t xml:space="preserve"> </w:t>
+      </w:r>
+      <w:proofErr w:type="gramStart"/>
       <w:r>
         <w:rPr>
           <w:rFonts w:ascii="Lucida Console" w:hAnsi="Lucida Console" w:cs="Cascadia Mono"/>
@@ -7468,7 +8442,26 @@
           <w:sz w:val="19"/>
           <w:szCs w:val="19"/>
         </w:rPr>
-        <w:t xml:space="preserve">    </w:t>
+        <w:t>1;</w:t>
+      </w:r>
+      <w:r>
+        <w:rPr>
+          <w:rFonts w:ascii="Lucida Console" w:hAnsi="Lucida Console" w:cs="Cascadia Mono"/>
+          <w:color w:val="000000"/>
+          <w:sz w:val="19"/>
+          <w:szCs w:val="19"/>
+        </w:rPr>
+        <w:t xml:space="preserve">   </w:t>
+      </w:r>
+      <w:proofErr w:type="gramEnd"/>
+      <w:r>
+        <w:rPr>
+          <w:rFonts w:ascii="Lucida Console" w:hAnsi="Lucida Console" w:cs="Cascadia Mono"/>
+          <w:color w:val="000000"/>
+          <w:sz w:val="19"/>
+          <w:szCs w:val="19"/>
+        </w:rPr>
+        <w:t xml:space="preserve"> </w:t>
       </w:r>
       <w:r>
         <w:rPr>
@@ -7806,7 +8799,6 @@
           <w:sz w:val="19"/>
           <w:szCs w:val="19"/>
         </w:rPr>
-        <w:lastRenderedPageBreak/>
         <w:tab/>
       </w:r>
       <w:r>
@@ -8100,8 +9092,19 @@
           <w:sz w:val="19"/>
           <w:szCs w:val="19"/>
         </w:rPr>
-        <w:t xml:space="preserve"> mod;   </w:t>
-      </w:r>
+        <w:t xml:space="preserve"> </w:t>
+      </w:r>
+      <w:proofErr w:type="gramStart"/>
+      <w:r>
+        <w:rPr>
+          <w:rFonts w:ascii="Lucida Console" w:hAnsi="Lucida Console" w:cs="Cascadia Mono"/>
+          <w:color w:val="000000"/>
+          <w:sz w:val="19"/>
+          <w:szCs w:val="19"/>
+        </w:rPr>
+        <w:t xml:space="preserve">mod;   </w:t>
+      </w:r>
+      <w:proofErr w:type="gramEnd"/>
       <w:r>
         <w:rPr>
           <w:rFonts w:ascii="Lucida Console" w:hAnsi="Lucida Console" w:cs="Cascadia Mono"/>
@@ -8191,19 +9194,18 @@
           <w:szCs w:val="19"/>
         </w:rPr>
         <w:tab/>
-        <w:t>roots.push_back(x2);</w:t>
-      </w:r>
-    </w:p>
-    <w:p>
-      <w:pPr>
-        <w:spacing w:after="0"/>
+      </w:r>
+      <w:proofErr w:type="gramStart"/>
+      <w:r>
         <w:rPr>
           <w:rFonts w:ascii="Lucida Console" w:hAnsi="Lucida Console" w:cs="Cascadia Mono"/>
           <w:color w:val="000000"/>
           <w:sz w:val="19"/>
           <w:szCs w:val="19"/>
         </w:rPr>
-      </w:pPr>
+        <w:t>roots.push</w:t>
+      </w:r>
+      <w:proofErr w:type="gramEnd"/>
       <w:r>
         <w:rPr>
           <w:rFonts w:ascii="Lucida Console" w:hAnsi="Lucida Console" w:cs="Cascadia Mono"/>
@@ -8211,8 +9213,47 @@
           <w:sz w:val="19"/>
           <w:szCs w:val="19"/>
         </w:rPr>
+        <w:t>_back(x2);</w:t>
+      </w:r>
+    </w:p>
+    <w:p>
+      <w:pPr>
+        <w:spacing w:after="0"/>
+        <w:rPr>
+          <w:rFonts w:ascii="Lucida Console" w:hAnsi="Lucida Console" w:cs="Cascadia Mono"/>
+          <w:color w:val="000000"/>
+          <w:sz w:val="19"/>
+          <w:szCs w:val="19"/>
+        </w:rPr>
+      </w:pPr>
+      <w:r>
+        <w:rPr>
+          <w:rFonts w:ascii="Lucida Console" w:hAnsi="Lucida Console" w:cs="Cascadia Mono"/>
+          <w:color w:val="000000"/>
+          <w:sz w:val="19"/>
+          <w:szCs w:val="19"/>
+        </w:rPr>
         <w:tab/>
-        <w:t xml:space="preserve">roots.push_back(mod </w:t>
+      </w:r>
+      <w:proofErr w:type="gramStart"/>
+      <w:r>
+        <w:rPr>
+          <w:rFonts w:ascii="Lucida Console" w:hAnsi="Lucida Console" w:cs="Cascadia Mono"/>
+          <w:color w:val="000000"/>
+          <w:sz w:val="19"/>
+          <w:szCs w:val="19"/>
+        </w:rPr>
+        <w:t>roots.push</w:t>
+      </w:r>
+      <w:proofErr w:type="gramEnd"/>
+      <w:r>
+        <w:rPr>
+          <w:rFonts w:ascii="Lucida Console" w:hAnsi="Lucida Console" w:cs="Cascadia Mono"/>
+          <w:color w:val="000000"/>
+          <w:sz w:val="19"/>
+          <w:szCs w:val="19"/>
+        </w:rPr>
+        <w:t xml:space="preserve">_back(mod </w:t>
       </w:r>
       <w:r>
         <w:rPr>
@@ -8334,7 +9375,26 @@
           <w:szCs w:val="19"/>
         </w:rPr>
         <w:tab/>
-        <w:t xml:space="preserve">roots.push_back(mod </w:t>
+      </w:r>
+      <w:proofErr w:type="gramStart"/>
+      <w:r>
+        <w:rPr>
+          <w:rFonts w:ascii="Lucida Console" w:hAnsi="Lucida Console" w:cs="Cascadia Mono"/>
+          <w:color w:val="000000"/>
+          <w:sz w:val="19"/>
+          <w:szCs w:val="19"/>
+        </w:rPr>
+        <w:t>roots.push</w:t>
+      </w:r>
+      <w:proofErr w:type="gramEnd"/>
+      <w:r>
+        <w:rPr>
+          <w:rFonts w:ascii="Lucida Console" w:hAnsi="Lucida Console" w:cs="Cascadia Mono"/>
+          <w:color w:val="000000"/>
+          <w:sz w:val="19"/>
+          <w:szCs w:val="19"/>
+        </w:rPr>
+        <w:t xml:space="preserve">_back(mod </w:t>
       </w:r>
       <w:r>
         <w:rPr>
@@ -8400,7 +9460,26 @@
           <w:szCs w:val="19"/>
         </w:rPr>
         <w:tab/>
-        <w:t xml:space="preserve">roots.push_back(mod </w:t>
+      </w:r>
+      <w:proofErr w:type="gramStart"/>
+      <w:r>
+        <w:rPr>
+          <w:rFonts w:ascii="Lucida Console" w:hAnsi="Lucida Console" w:cs="Cascadia Mono"/>
+          <w:color w:val="000000"/>
+          <w:sz w:val="19"/>
+          <w:szCs w:val="19"/>
+        </w:rPr>
+        <w:t>roots.push</w:t>
+      </w:r>
+      <w:proofErr w:type="gramEnd"/>
+      <w:r>
+        <w:rPr>
+          <w:rFonts w:ascii="Lucida Console" w:hAnsi="Lucida Console" w:cs="Cascadia Mono"/>
+          <w:color w:val="000000"/>
+          <w:sz w:val="19"/>
+          <w:szCs w:val="19"/>
+        </w:rPr>
+        <w:t xml:space="preserve">_back(mod </w:t>
       </w:r>
       <w:r>
         <w:rPr>
@@ -8525,7 +9604,26 @@
           <w:szCs w:val="19"/>
         </w:rPr>
         <w:tab/>
-        <w:t xml:space="preserve">roots.push_back(x2 </w:t>
+      </w:r>
+      <w:proofErr w:type="gramStart"/>
+      <w:r>
+        <w:rPr>
+          <w:rFonts w:ascii="Lucida Console" w:hAnsi="Lucida Console" w:cs="Cascadia Mono"/>
+          <w:color w:val="000000"/>
+          <w:sz w:val="19"/>
+          <w:szCs w:val="19"/>
+        </w:rPr>
+        <w:t>roots.push</w:t>
+      </w:r>
+      <w:proofErr w:type="gramEnd"/>
+      <w:r>
+        <w:rPr>
+          <w:rFonts w:ascii="Lucida Console" w:hAnsi="Lucida Console" w:cs="Cascadia Mono"/>
+          <w:color w:val="000000"/>
+          <w:sz w:val="19"/>
+          <w:szCs w:val="19"/>
+        </w:rPr>
+        <w:t xml:space="preserve">_back(x2 </w:t>
       </w:r>
       <w:r>
         <w:rPr>
@@ -8591,7 +9689,26 @@
           <w:szCs w:val="19"/>
         </w:rPr>
         <w:tab/>
-        <w:t xml:space="preserve">roots.push_back(mod </w:t>
+      </w:r>
+      <w:proofErr w:type="gramStart"/>
+      <w:r>
+        <w:rPr>
+          <w:rFonts w:ascii="Lucida Console" w:hAnsi="Lucida Console" w:cs="Cascadia Mono"/>
+          <w:color w:val="000000"/>
+          <w:sz w:val="19"/>
+          <w:szCs w:val="19"/>
+        </w:rPr>
+        <w:t>roots.push</w:t>
+      </w:r>
+      <w:proofErr w:type="gramEnd"/>
+      <w:r>
+        <w:rPr>
+          <w:rFonts w:ascii="Lucida Console" w:hAnsi="Lucida Console" w:cs="Cascadia Mono"/>
+          <w:color w:val="000000"/>
+          <w:sz w:val="19"/>
+          <w:szCs w:val="19"/>
+        </w:rPr>
+        <w:t xml:space="preserve">_back(mod </w:t>
       </w:r>
       <w:r>
         <w:rPr>
@@ -9611,13 +10728,23 @@
         </w:rPr>
         <w:br/>
       </w:r>
-      <w:r>
-        <w:rPr>
-          <w:rFonts w:cstheme="minorHAnsi"/>
-          <w:sz w:val="24"/>
-          <w:szCs w:val="24"/>
-        </w:rPr>
-        <w:t>gcd(4, 32) = 4.</w:t>
+      <w:proofErr w:type="gramStart"/>
+      <w:r>
+        <w:rPr>
+          <w:rFonts w:cstheme="minorHAnsi"/>
+          <w:sz w:val="24"/>
+          <w:szCs w:val="24"/>
+        </w:rPr>
+        <w:t>gcd(</w:t>
+      </w:r>
+      <w:proofErr w:type="gramEnd"/>
+      <w:r>
+        <w:rPr>
+          <w:rFonts w:cstheme="minorHAnsi"/>
+          <w:sz w:val="24"/>
+          <w:szCs w:val="24"/>
+        </w:rPr>
+        <w:t>4, 32) = 4.</w:t>
       </w:r>
       <w:r>
         <w:rPr>
@@ -9768,12 +10895,21 @@
         </w:rPr>
         <w:br/>
       </w:r>
-      <w:r>
-        <w:rPr>
-          <w:sz w:val="24"/>
-          <w:szCs w:val="24"/>
-        </w:rPr>
-        <w:t>modsqrt(1, 32) = 1, 31, 15, 17,</w:t>
+      <w:proofErr w:type="gramStart"/>
+      <w:r>
+        <w:rPr>
+          <w:sz w:val="24"/>
+          <w:szCs w:val="24"/>
+        </w:rPr>
+        <w:t>modsqrt(</w:t>
+      </w:r>
+      <w:proofErr w:type="gramEnd"/>
+      <w:r>
+        <w:rPr>
+          <w:sz w:val="24"/>
+          <w:szCs w:val="24"/>
+        </w:rPr>
+        <w:t>1, 32) = 1, 31, 15, 17,</w:t>
       </w:r>
     </w:p>
     <w:p>
@@ -9789,7 +10925,6 @@
           <w:sz w:val="24"/>
           <w:szCs w:val="24"/>
         </w:rPr>
-        <w:lastRenderedPageBreak/>
         <w:t>We only need the 1</w:t>
       </w:r>
       <w:r>
@@ -9969,13 +11104,23 @@
           <w:szCs w:val="24"/>
         </w:rPr>
       </w:pPr>
-      <w:r>
-        <w:rPr>
-          <w:rFonts w:cstheme="minorHAnsi"/>
-          <w:sz w:val="24"/>
-          <w:szCs w:val="24"/>
-        </w:rPr>
-        <w:t>So the 1</w:t>
+      <w:proofErr w:type="gramStart"/>
+      <w:r>
+        <w:rPr>
+          <w:rFonts w:cstheme="minorHAnsi"/>
+          <w:sz w:val="24"/>
+          <w:szCs w:val="24"/>
+        </w:rPr>
+        <w:t>So</w:t>
+      </w:r>
+      <w:proofErr w:type="gramEnd"/>
+      <w:r>
+        <w:rPr>
+          <w:rFonts w:cstheme="minorHAnsi"/>
+          <w:sz w:val="24"/>
+          <w:szCs w:val="24"/>
+        </w:rPr>
+        <w:t xml:space="preserve"> the 1</w:t>
       </w:r>
       <w:r>
         <w:rPr>
@@ -10060,7 +11205,25 @@
           <w:sz w:val="24"/>
           <w:szCs w:val="24"/>
         </w:rPr>
-        <w:t xml:space="preserve"> i.e. 30, 22, 14, 6.</w:t>
+        <w:t xml:space="preserve"> </w:t>
+      </w:r>
+      <w:proofErr w:type="gramStart"/>
+      <w:r>
+        <w:rPr>
+          <w:rFonts w:cstheme="minorHAnsi"/>
+          <w:sz w:val="24"/>
+          <w:szCs w:val="24"/>
+        </w:rPr>
+        <w:t>i.e.</w:t>
+      </w:r>
+      <w:proofErr w:type="gramEnd"/>
+      <w:r>
+        <w:rPr>
+          <w:rFonts w:cstheme="minorHAnsi"/>
+          <w:sz w:val="24"/>
+          <w:szCs w:val="24"/>
+        </w:rPr>
+        <w:t xml:space="preserve"> 30, 22, 14, 6.</w:t>
       </w:r>
     </w:p>
     <w:p>
@@ -10071,13 +11234,23 @@
           <w:szCs w:val="24"/>
         </w:rPr>
       </w:pPr>
-      <w:r>
-        <w:rPr>
-          <w:rFonts w:cstheme="minorHAnsi"/>
-          <w:sz w:val="24"/>
-          <w:szCs w:val="24"/>
-        </w:rPr>
-        <w:t>So we have:</w:t>
+      <w:proofErr w:type="gramStart"/>
+      <w:r>
+        <w:rPr>
+          <w:rFonts w:cstheme="minorHAnsi"/>
+          <w:sz w:val="24"/>
+          <w:szCs w:val="24"/>
+        </w:rPr>
+        <w:t>So</w:t>
+      </w:r>
+      <w:proofErr w:type="gramEnd"/>
+      <w:r>
+        <w:rPr>
+          <w:rFonts w:cstheme="minorHAnsi"/>
+          <w:sz w:val="24"/>
+          <w:szCs w:val="24"/>
+        </w:rPr>
+        <w:t xml:space="preserve"> we have:</w:t>
       </w:r>
     </w:p>
     <w:p>
@@ -10088,12 +11261,21 @@
           <w:szCs w:val="24"/>
         </w:rPr>
       </w:pPr>
-      <w:r>
-        <w:rPr>
-          <w:sz w:val="24"/>
-          <w:szCs w:val="24"/>
-        </w:rPr>
-        <w:t>modsqrt(4, 32) = 2, 30, 10, 22, 18, 14, 26, 6,</w:t>
+      <w:proofErr w:type="gramStart"/>
+      <w:r>
+        <w:rPr>
+          <w:sz w:val="24"/>
+          <w:szCs w:val="24"/>
+        </w:rPr>
+        <w:t>modsqrt(</w:t>
+      </w:r>
+      <w:proofErr w:type="gramEnd"/>
+      <w:r>
+        <w:rPr>
+          <w:sz w:val="24"/>
+          <w:szCs w:val="24"/>
+        </w:rPr>
+        <w:t>4, 32) = 2, 30, 10, 22, 18, 14, 26, 6,</w:t>
       </w:r>
     </w:p>
     <w:p>
@@ -10143,12 +11325,21 @@
           <w:szCs w:val="24"/>
         </w:rPr>
       </w:pPr>
-      <w:r>
-        <w:rPr>
-          <w:sz w:val="24"/>
-          <w:szCs w:val="24"/>
-        </w:rPr>
-        <w:t xml:space="preserve">modsqrt(4, 32) = </w:t>
+      <w:proofErr w:type="gramStart"/>
+      <w:r>
+        <w:rPr>
+          <w:sz w:val="24"/>
+          <w:szCs w:val="24"/>
+        </w:rPr>
+        <w:t>modsqrt(</w:t>
+      </w:r>
+      <w:proofErr w:type="gramEnd"/>
+      <w:r>
+        <w:rPr>
+          <w:sz w:val="24"/>
+          <w:szCs w:val="24"/>
+        </w:rPr>
+        <w:t xml:space="preserve">4, 32) = </w:t>
       </w:r>
       <w:r>
         <w:rPr>
@@ -10280,12 +11471,21 @@
           <w:szCs w:val="24"/>
         </w:rPr>
       </w:pPr>
-      <w:r>
-        <w:rPr>
-          <w:sz w:val="24"/>
-          <w:szCs w:val="24"/>
-        </w:rPr>
-        <w:t xml:space="preserve">Gcd(36, 243) = 9, so we need to solve </w:t>
+      <w:proofErr w:type="gramStart"/>
+      <w:r>
+        <w:rPr>
+          <w:sz w:val="24"/>
+          <w:szCs w:val="24"/>
+        </w:rPr>
+        <w:t>Gcd(</w:t>
+      </w:r>
+      <w:proofErr w:type="gramEnd"/>
+      <w:r>
+        <w:rPr>
+          <w:sz w:val="24"/>
+          <w:szCs w:val="24"/>
+        </w:rPr>
+        <w:t xml:space="preserve">36, 243) = 9, so we need to solve </w:t>
       </w:r>
       <w:r>
         <w:rPr>
@@ -10605,7 +11805,23 @@
           <w:sz w:val="24"/>
           <w:szCs w:val="24"/>
         </w:rPr>
-        <w:t xml:space="preserve"> 1 (modulo 3), so modsqrt(4, 3) </w:t>
+        <w:t xml:space="preserve"> 1 (modulo 3), so </w:t>
+      </w:r>
+      <w:proofErr w:type="gramStart"/>
+      <w:r>
+        <w:rPr>
+          <w:sz w:val="24"/>
+          <w:szCs w:val="24"/>
+        </w:rPr>
+        <w:t>modsqrt(</w:t>
+      </w:r>
+      <w:proofErr w:type="gramEnd"/>
+      <w:r>
+        <w:rPr>
+          <w:sz w:val="24"/>
+          <w:szCs w:val="24"/>
+        </w:rPr>
+        <w:t xml:space="preserve">4, 3) </w:t>
       </w:r>
       <w:r>
         <w:rPr>
@@ -10631,12 +11847,21 @@
           <w:szCs w:val="24"/>
         </w:rPr>
       </w:pPr>
-      <w:r>
-        <w:rPr>
-          <w:sz w:val="24"/>
-          <w:szCs w:val="24"/>
-        </w:rPr>
-        <w:t>modsqrt(1, 3) = 1, 2,</w:t>
+      <w:proofErr w:type="gramStart"/>
+      <w:r>
+        <w:rPr>
+          <w:sz w:val="24"/>
+          <w:szCs w:val="24"/>
+        </w:rPr>
+        <w:t>modsqrt(</w:t>
+      </w:r>
+      <w:proofErr w:type="gramEnd"/>
+      <w:r>
+        <w:rPr>
+          <w:sz w:val="24"/>
+          <w:szCs w:val="24"/>
+        </w:rPr>
+        <w:t>1, 3) = 1, 2,</w:t>
       </w:r>
       <w:r>
         <w:rPr>
@@ -10654,14 +11879,25 @@
           <w:szCs w:val="24"/>
         </w:rPr>
       </w:pPr>
-      <w:r>
-        <w:rPr>
-          <w:b/>
-          <w:i/>
-          <w:sz w:val="24"/>
-          <w:szCs w:val="24"/>
-        </w:rPr>
-        <w:t>modsqrt(4, 243) = 241, 2</w:t>
+      <w:proofErr w:type="gramStart"/>
+      <w:r>
+        <w:rPr>
+          <w:b/>
+          <w:i/>
+          <w:sz w:val="24"/>
+          <w:szCs w:val="24"/>
+        </w:rPr>
+        <w:t>modsqrt(</w:t>
+      </w:r>
+      <w:proofErr w:type="gramEnd"/>
+      <w:r>
+        <w:rPr>
+          <w:b/>
+          <w:i/>
+          <w:sz w:val="24"/>
+          <w:szCs w:val="24"/>
+        </w:rPr>
+        <w:t>4, 243) = 241, 2</w:t>
       </w:r>
       <w:r>
         <w:rPr>
@@ -11012,14 +12248,25 @@
           <w:szCs w:val="24"/>
         </w:rPr>
       </w:pPr>
-      <w:r>
-        <w:rPr>
-          <w:b/>
-          <w:i/>
-          <w:sz w:val="24"/>
-          <w:szCs w:val="24"/>
-        </w:rPr>
-        <w:t xml:space="preserve">modsqrt(9, </w:t>
+      <w:proofErr w:type="gramStart"/>
+      <w:r>
+        <w:rPr>
+          <w:b/>
+          <w:i/>
+          <w:sz w:val="24"/>
+          <w:szCs w:val="24"/>
+        </w:rPr>
+        <w:t>modsqrt(</w:t>
+      </w:r>
+      <w:proofErr w:type="gramEnd"/>
+      <w:r>
+        <w:rPr>
+          <w:b/>
+          <w:i/>
+          <w:sz w:val="24"/>
+          <w:szCs w:val="24"/>
+        </w:rPr>
+        <w:t xml:space="preserve">9, </w:t>
       </w:r>
       <w:r>
         <w:rPr>
@@ -11045,6 +12292,7 @@
           <w:sz w:val="24"/>
           <w:szCs w:val="24"/>
         </w:rPr>
+        <w:lastRenderedPageBreak/>
         <w:t xml:space="preserve">To solve </w:t>
       </w:r>
       <w:r>
@@ -11147,7 +12395,23 @@
           <w:sz w:val="24"/>
           <w:szCs w:val="24"/>
         </w:rPr>
-        <w:t xml:space="preserve"> modulo 243. If we use 241 we get: 237, 6, 75, 168, 156, 87. If we use 2 we get 6, 237, 168, 75, 87, 56 i.e. we </w:t>
+        <w:t xml:space="preserve"> modulo 243. If we use </w:t>
+      </w:r>
+      <w:proofErr w:type="gramStart"/>
+      <w:r>
+        <w:rPr>
+          <w:sz w:val="24"/>
+          <w:szCs w:val="24"/>
+        </w:rPr>
+        <w:t>241</w:t>
+      </w:r>
+      <w:proofErr w:type="gramEnd"/>
+      <w:r>
+        <w:rPr>
+          <w:sz w:val="24"/>
+          <w:szCs w:val="24"/>
+        </w:rPr>
+        <w:t xml:space="preserve"> we get: 237, 6, 75, 168, 156, 87. If we use 2 we get 6, 237, 168, 75, 87, 56 i.e. we </w:t>
       </w:r>
       <w:r>
         <w:rPr>
@@ -11209,7 +12473,23 @@
           <w:sz w:val="24"/>
           <w:szCs w:val="24"/>
         </w:rPr>
-        <w:t xml:space="preserve">(i.e. </w:t>
+        <w:t>(</w:t>
+      </w:r>
+      <w:proofErr w:type="gramStart"/>
+      <w:r>
+        <w:rPr>
+          <w:sz w:val="24"/>
+          <w:szCs w:val="24"/>
+        </w:rPr>
+        <w:t>i.e.</w:t>
+      </w:r>
+      <w:proofErr w:type="gramEnd"/>
+      <w:r>
+        <w:rPr>
+          <w:sz w:val="24"/>
+          <w:szCs w:val="24"/>
+        </w:rPr>
+        <w:t xml:space="preserve"> </w:t>
       </w:r>
       <w:r>
         <w:rPr>
@@ -11296,7 +12576,23 @@
           <w:sz w:val="24"/>
           <w:szCs w:val="24"/>
         </w:rPr>
-        <w:t xml:space="preserve"> 8 = 48 roots. E.g. 5826 </w:t>
+        <w:t xml:space="preserve"> 8 = 48 roots. </w:t>
+      </w:r>
+      <w:proofErr w:type="gramStart"/>
+      <w:r>
+        <w:rPr>
+          <w:sz w:val="24"/>
+          <w:szCs w:val="24"/>
+        </w:rPr>
+        <w:t>E.g.</w:t>
+      </w:r>
+      <w:proofErr w:type="gramEnd"/>
+      <w:r>
+        <w:rPr>
+          <w:sz w:val="24"/>
+          <w:szCs w:val="24"/>
+        </w:rPr>
+        <w:t xml:space="preserve"> 5826 </w:t>
       </w:r>
       <w:r>
         <w:rPr>
@@ -12040,7 +13336,6 @@
                 <w:b/>
                 <w:sz w:val="28"/>
               </w:rPr>
-              <w:lastRenderedPageBreak/>
               <w:t>14</w:t>
             </w:r>
           </w:p>
@@ -12620,7 +13915,23 @@
           <w:sz w:val="24"/>
           <w:szCs w:val="24"/>
         </w:rPr>
-        <w:t xml:space="preserve"> modulo 8, so modsqrt(8x+1, 8) </w:t>
+        <w:t xml:space="preserve"> modulo 8, so </w:t>
+      </w:r>
+      <w:proofErr w:type="gramStart"/>
+      <w:r>
+        <w:rPr>
+          <w:sz w:val="24"/>
+          <w:szCs w:val="24"/>
+        </w:rPr>
+        <w:t>modsqrt(</w:t>
+      </w:r>
+      <w:proofErr w:type="gramEnd"/>
+      <w:r>
+        <w:rPr>
+          <w:sz w:val="24"/>
+          <w:szCs w:val="24"/>
+        </w:rPr>
+        <w:t xml:space="preserve">8x+1, 8) </w:t>
       </w:r>
       <w:r>
         <w:rPr>
@@ -12687,13 +13998,23 @@
           <w:lang w:val="nl-NL"/>
         </w:rPr>
       </w:pPr>
+      <w:proofErr w:type="gramStart"/>
       <w:r>
         <w:rPr>
           <w:sz w:val="24"/>
           <w:szCs w:val="24"/>
           <w:lang w:val="nl-NL"/>
         </w:rPr>
-        <w:t>modsqrt(17, 8) = 1</w:t>
+        <w:t>modsqrt(</w:t>
+      </w:r>
+      <w:proofErr w:type="gramEnd"/>
+      <w:r>
+        <w:rPr>
+          <w:sz w:val="24"/>
+          <w:szCs w:val="24"/>
+          <w:lang w:val="nl-NL"/>
+        </w:rPr>
+        <w:t>17, 8) = 1</w:t>
       </w:r>
     </w:p>
     <w:p>
@@ -12705,13 +14026,23 @@
           <w:lang w:val="nl-NL"/>
         </w:rPr>
       </w:pPr>
+      <w:proofErr w:type="gramStart"/>
       <w:r>
         <w:rPr>
           <w:sz w:val="24"/>
           <w:szCs w:val="24"/>
           <w:lang w:val="nl-NL"/>
         </w:rPr>
-        <w:t>modsqrt(17, 16) = 9</w:t>
+        <w:t>modsqrt(</w:t>
+      </w:r>
+      <w:proofErr w:type="gramEnd"/>
+      <w:r>
+        <w:rPr>
+          <w:sz w:val="24"/>
+          <w:szCs w:val="24"/>
+          <w:lang w:val="nl-NL"/>
+        </w:rPr>
+        <w:t>17, 16) = 9</w:t>
       </w:r>
     </w:p>
     <w:p>
@@ -12723,13 +14054,23 @@
           <w:lang w:val="nl-NL"/>
         </w:rPr>
       </w:pPr>
+      <w:proofErr w:type="gramStart"/>
       <w:r>
         <w:rPr>
           <w:sz w:val="24"/>
           <w:szCs w:val="24"/>
           <w:lang w:val="nl-NL"/>
         </w:rPr>
-        <w:t>modsqrt(17, 32) = 9</w:t>
+        <w:t>modsqrt(</w:t>
+      </w:r>
+      <w:proofErr w:type="gramEnd"/>
+      <w:r>
+        <w:rPr>
+          <w:sz w:val="24"/>
+          <w:szCs w:val="24"/>
+          <w:lang w:val="nl-NL"/>
+        </w:rPr>
+        <w:t>17, 32) = 9</w:t>
       </w:r>
     </w:p>
     <w:p>
@@ -12741,13 +14082,23 @@
           <w:lang w:val="nl-NL"/>
         </w:rPr>
       </w:pPr>
+      <w:proofErr w:type="gramStart"/>
       <w:r>
         <w:rPr>
           <w:sz w:val="24"/>
           <w:szCs w:val="24"/>
           <w:lang w:val="nl-NL"/>
         </w:rPr>
-        <w:t>modsqrt(17, 64) = 41</w:t>
+        <w:t>modsqrt(</w:t>
+      </w:r>
+      <w:proofErr w:type="gramEnd"/>
+      <w:r>
+        <w:rPr>
+          <w:sz w:val="24"/>
+          <w:szCs w:val="24"/>
+          <w:lang w:val="nl-NL"/>
+        </w:rPr>
+        <w:t>17, 64) = 41</w:t>
       </w:r>
     </w:p>
     <w:p>
@@ -12759,13 +14110,23 @@
           <w:lang w:val="nl-NL"/>
         </w:rPr>
       </w:pPr>
+      <w:proofErr w:type="gramStart"/>
       <w:r>
         <w:rPr>
           <w:sz w:val="24"/>
           <w:szCs w:val="24"/>
           <w:lang w:val="nl-NL"/>
         </w:rPr>
-        <w:t>modsqrt(17, 128) = 105</w:t>
+        <w:t>modsqrt(</w:t>
+      </w:r>
+      <w:proofErr w:type="gramEnd"/>
+      <w:r>
+        <w:rPr>
+          <w:sz w:val="24"/>
+          <w:szCs w:val="24"/>
+          <w:lang w:val="nl-NL"/>
+        </w:rPr>
+        <w:t>17, 128) = 105</w:t>
       </w:r>
     </w:p>
     <w:p>
@@ -12776,12 +14137,21 @@
           <w:szCs w:val="24"/>
         </w:rPr>
       </w:pPr>
-      <w:r>
-        <w:rPr>
-          <w:sz w:val="24"/>
-          <w:szCs w:val="24"/>
-        </w:rPr>
-        <w:t>modsqrt(17, 256) = 233</w:t>
+      <w:proofErr w:type="gramStart"/>
+      <w:r>
+        <w:rPr>
+          <w:sz w:val="24"/>
+          <w:szCs w:val="24"/>
+        </w:rPr>
+        <w:t>modsqrt(</w:t>
+      </w:r>
+      <w:proofErr w:type="gramEnd"/>
+      <w:r>
+        <w:rPr>
+          <w:sz w:val="24"/>
+          <w:szCs w:val="24"/>
+        </w:rPr>
+        <w:t>17, 256) = 233</w:t>
       </w:r>
     </w:p>
     <w:p>
@@ -12792,12 +14162,21 @@
           <w:szCs w:val="24"/>
         </w:rPr>
       </w:pPr>
-      <w:r>
-        <w:rPr>
-          <w:sz w:val="24"/>
-          <w:szCs w:val="24"/>
-        </w:rPr>
-        <w:t>modsqrt(17, 512) = 233</w:t>
+      <w:proofErr w:type="gramStart"/>
+      <w:r>
+        <w:rPr>
+          <w:sz w:val="24"/>
+          <w:szCs w:val="24"/>
+        </w:rPr>
+        <w:t>modsqrt(</w:t>
+      </w:r>
+      <w:proofErr w:type="gramEnd"/>
+      <w:r>
+        <w:rPr>
+          <w:sz w:val="24"/>
+          <w:szCs w:val="24"/>
+        </w:rPr>
+        <w:t>17, 512) = 233</w:t>
       </w:r>
     </w:p>
     <w:p>
@@ -12963,6 +14342,7 @@
         <w:pStyle w:val="Heading1"/>
       </w:pPr>
       <w:r>
+        <w:lastRenderedPageBreak/>
         <w:t>Example 3</w:t>
       </w:r>
     </w:p>
@@ -13070,7 +14450,23 @@
           <w:sz w:val="24"/>
           <w:szCs w:val="24"/>
         </w:rPr>
-        <w:t>), and modulo 243( = 3</w:t>
+        <w:t xml:space="preserve">), and modulo </w:t>
+      </w:r>
+      <w:proofErr w:type="gramStart"/>
+      <w:r>
+        <w:rPr>
+          <w:sz w:val="24"/>
+          <w:szCs w:val="24"/>
+        </w:rPr>
+        <w:t>243( =</w:t>
+      </w:r>
+      <w:proofErr w:type="gramEnd"/>
+      <w:r>
+        <w:rPr>
+          <w:sz w:val="24"/>
+          <w:szCs w:val="24"/>
+        </w:rPr>
+        <w:t xml:space="preserve"> 3</w:t>
       </w:r>
       <w:r>
         <w:rPr>
@@ -13159,7 +14555,23 @@
           <w:sz w:val="24"/>
           <w:szCs w:val="24"/>
         </w:rPr>
-        <w:t xml:space="preserve"> =  8, so the roots are 0, 8, 16, 24</w:t>
+        <w:t xml:space="preserve"> </w:t>
+      </w:r>
+      <w:proofErr w:type="gramStart"/>
+      <w:r>
+        <w:rPr>
+          <w:sz w:val="24"/>
+          <w:szCs w:val="24"/>
+        </w:rPr>
+        <w:t>=  8</w:t>
+      </w:r>
+      <w:proofErr w:type="gramEnd"/>
+      <w:r>
+        <w:rPr>
+          <w:sz w:val="24"/>
+          <w:szCs w:val="24"/>
+        </w:rPr>
+        <w:t>, so the roots are 0, 8, 16, 24</w:t>
       </w:r>
     </w:p>
     <w:p>
@@ -13233,7 +14645,23 @@
           <w:sz w:val="24"/>
           <w:szCs w:val="24"/>
         </w:rPr>
-        <w:t xml:space="preserve"> =  27, so the roots are 0, 27, 54, 81, 108, 135, 162, 189, 216.</w:t>
+        <w:t xml:space="preserve"> </w:t>
+      </w:r>
+      <w:proofErr w:type="gramStart"/>
+      <w:r>
+        <w:rPr>
+          <w:sz w:val="24"/>
+          <w:szCs w:val="24"/>
+        </w:rPr>
+        <w:t>=  27</w:t>
+      </w:r>
+      <w:proofErr w:type="gramEnd"/>
+      <w:r>
+        <w:rPr>
+          <w:sz w:val="24"/>
+          <w:szCs w:val="24"/>
+        </w:rPr>
+        <w:t>, so the roots are 0, 27, 54, 81, 108, 135, 162, 189, 216.</w:t>
       </w:r>
     </w:p>
     <w:p>
@@ -13299,15 +14727,7 @@
           <w:sz w:val="24"/>
           <w:szCs w:val="24"/>
         </w:rPr>
-        <w:t xml:space="preserve">0, 216, 432, 648, 864, 1080, 1296, 1512, 1728, 1944, 2160, 2376, 2592, 2808, 3024, 3240, 3456, 3672, 3888, 4104, 4320, 4536, 4752, 4968, 5184, 5400, 5616, 5832, 6048, 6264, 6480, </w:t>
-      </w:r>
-      <w:r>
-        <w:rPr>
-          <w:sz w:val="24"/>
-          <w:szCs w:val="24"/>
-        </w:rPr>
-        <w:lastRenderedPageBreak/>
-        <w:t>6696, 6912, 7128, 7344, 7560</w:t>
+        <w:t>0, 216, 432, 648, 864, 1080, 1296, 1512, 1728, 1944, 2160, 2376, 2592, 2808, 3024, 3240, 3456, 3672, 3888, 4104, 4320, 4536, 4752, 4968, 5184, 5400, 5616, 5832, 6048, 6264, 6480, 6696, 6912, 7128, 7344, 7560</w:t>
       </w:r>
       <w:r>
         <w:rPr>
@@ -14533,6 +15953,21 @@
       <w:u w:val="single"/>
     </w:rPr>
   </w:style>
+  <w:style w:type="character" w:customStyle="1" w:styleId="mi">
+    <w:name w:val="mi"/>
+    <w:basedOn w:val="DefaultParagraphFont"/>
+    <w:rsid w:val="009D347F"/>
+  </w:style>
+  <w:style w:type="character" w:customStyle="1" w:styleId="mo">
+    <w:name w:val="mo"/>
+    <w:basedOn w:val="DefaultParagraphFont"/>
+    <w:rsid w:val="009D347F"/>
+  </w:style>
+  <w:style w:type="character" w:customStyle="1" w:styleId="mn">
+    <w:name w:val="mn"/>
+    <w:basedOn w:val="DefaultParagraphFont"/>
+    <w:rsid w:val="009D347F"/>
+  </w:style>
 </w:styles>
 </file>
 

</xml_diff>